<commit_message>
Add official author biography to back matter, KDP metadata, and cover specifications
</commit_message>
<xml_diff>
--- a/book/build/The_Conative_Integrative_Framework_Book_Thomas_Riebl_EN_6x9.docx
+++ b/book/build/The_Conative_Integrative_Framework_Book_Thomas_Riebl_EN_6x9.docx
@@ -24538,7 +24538,202 @@
       </w:r>
     </w:p>
     <w:bookmarkEnd w:id="107"/>
-    <w:bookmarkStart w:id="108" w:name="tool-attribution-colophon"/>
+    <w:bookmarkStart w:id="108" w:name="about-the-author"/>
+    <w:p>
+      <w:pPr>
+        <w:pStyle w:val="Heading1"/>
+      </w:pPr>
+      <w:r>
+        <w:t xml:space="preserve">About the Author</w:t>
+      </w:r>
+    </w:p>
+    <w:p>
+      <w:pPr>
+        <w:pStyle w:val="FirstParagraph"/>
+      </w:pPr>
+      <w:r>
+        <w:rPr>
+          <w:b/>
+          <w:bCs/>
+        </w:rPr>
+        <w:t xml:space="preserve">Thomas Riebl</w:t>
+      </w:r>
+      <w:r>
+        <w:t xml:space="preserve"> </w:t>
+      </w:r>
+      <w:r>
+        <w:t xml:space="preserve">is an independent researcher, systems thinker, and author based in Luxembourg. Born in 1960 in Western Germany, he spent over three decades in enterprise information technology, working as an independent IT consultant, systems architect, and senior IT manager at a premier global banking institution before retiring from the corporate sector in July 2025.</w:t>
+      </w:r>
+    </w:p>
+    <w:p>
+      <w:pPr>
+        <w:pStyle w:val="BodyText"/>
+      </w:pPr>
+      <w:r>
+        <w:t xml:space="preserve">Driven by a lifelong passion for foundational physics, cybernetics, and the nature of mind, Riebl began in 2019 an intensive research program at the intersection of theoretical neuroscience, computational psychiatry, and non-dual philosophy of mind. Through rigorous autodidactic self-study, he acquired a comprehensive command of advanced Bayesian statistics, probability theory, Markov decision processes, and information theory to construct the formal mathematical scaffolding for his work.</w:t>
+      </w:r>
+    </w:p>
+    <w:p>
+      <w:pPr>
+        <w:pStyle w:val="BodyText"/>
+      </w:pPr>
+      <w:r>
+        <w:t xml:space="preserve">Synthesizing the discoveries of Karl Friston (Active Inference), Giulio Tononi (Integrated Information Theory), Thomas Metzinger (Phenomenal Self-Models), and Bernardo Kastrup (Analytic Idealism), he developed</w:t>
+      </w:r>
+      <w:r>
+        <w:t xml:space="preserve"> </w:t>
+      </w:r>
+      <w:r>
+        <w:rPr>
+          <w:b/>
+          <w:bCs/>
+        </w:rPr>
+        <w:t xml:space="preserve">The Conative-Integrative Framework (CIF)</w:t>
+      </w:r>
+      <w:r>
+        <w:t xml:space="preserve">. Through his discovery of</w:t>
+      </w:r>
+      <w:r>
+        <w:t xml:space="preserve"> </w:t>
+      </w:r>
+      <w:r>
+        <w:rPr>
+          <w:b/>
+          <w:bCs/>
+        </w:rPr>
+        <w:t xml:space="preserve">The 6th Axiom of Consciousness</w:t>
+      </w:r>
+      <w:r>
+        <w:t xml:space="preserve"> </w:t>
+      </w:r>
+      <w:r>
+        <w:t xml:space="preserve">(</w:t>
+      </w:r>
+      <m:oMath>
+        <m:r>
+          <m:rPr>
+            <m:scr m:val="double-struck"/>
+            <m:sty m:val="p"/>
+          </m:rPr>
+          <m:t>E</m:t>
+        </m:r>
+        <m:r>
+          <m:rPr>
+            <m:sty m:val="p"/>
+          </m:rPr>
+          <m:t>[</m:t>
+        </m:r>
+        <m:r>
+          <m:rPr>
+            <m:sty m:val="p"/>
+          </m:rPr>
+          <m:t>Φ</m:t>
+        </m:r>
+        <m:r>
+          <m:rPr>
+            <m:sty m:val="p"/>
+          </m:rPr>
+          <m:t>(</m:t>
+        </m:r>
+        <m:r>
+          <m:t>t</m:t>
+        </m:r>
+        <m:r>
+          <m:rPr>
+            <m:sty m:val="p"/>
+          </m:rPr>
+          <m:t>+</m:t>
+        </m:r>
+        <m:r>
+          <m:t>1</m:t>
+        </m:r>
+        <m:r>
+          <m:rPr>
+            <m:sty m:val="p"/>
+          </m:rPr>
+          <m:t>)</m:t>
+        </m:r>
+        <m:r>
+          <m:rPr>
+            <m:sty m:val="p"/>
+          </m:rPr>
+          <m:t>∣</m:t>
+        </m:r>
+        <m:sSup>
+          <m:e>
+            <m:r>
+              <m:t>π</m:t>
+            </m:r>
+          </m:e>
+          <m:sup>
+            <m:r>
+              <m:rPr>
+                <m:sty m:val="p"/>
+              </m:rPr>
+              <m:t>*</m:t>
+            </m:r>
+          </m:sup>
+        </m:sSup>
+        <m:r>
+          <m:rPr>
+            <m:sty m:val="p"/>
+          </m:rPr>
+          <m:t>]</m:t>
+        </m:r>
+        <m:r>
+          <m:rPr>
+            <m:sty m:val="p"/>
+          </m:rPr>
+          <m:t>≥</m:t>
+        </m:r>
+        <m:r>
+          <m:rPr>
+            <m:sty m:val="p"/>
+          </m:rPr>
+          <m:t>Φ</m:t>
+        </m:r>
+        <m:r>
+          <m:rPr>
+            <m:sty m:val="p"/>
+          </m:rPr>
+          <m:t>(</m:t>
+        </m:r>
+        <m:r>
+          <m:t>t</m:t>
+        </m:r>
+        <m:r>
+          <m:rPr>
+            <m:sty m:val="p"/>
+          </m:rPr>
+          <m:t>)</m:t>
+        </m:r>
+      </m:oMath>
+      <w:r>
+        <w:t xml:space="preserve">) and the formalization of</w:t>
+      </w:r>
+      <w:r>
+        <w:t xml:space="preserve"> </w:t>
+      </w:r>
+      <w:r>
+        <w:rPr>
+          <w:i/>
+          <w:iCs/>
+        </w:rPr>
+        <w:t xml:space="preserve">Temporal Depth Agency</w:t>
+      </w:r>
+      <w:r>
+        <w:t xml:space="preserve">, Riebl provides the first mathematically closed bridge between 3rd-person cybernetic self-organization and 1st-person phenomenal causality.</w:t>
+      </w:r>
+    </w:p>
+    <w:p>
+      <w:r>
+        <w:pict>
+          <v:rect style="width:0;height:1.5pt" o:hralign="center" o:hrstd="t" o:hr="t"/>
+        </w:pict>
+      </w:r>
+    </w:p>
+    <w:bookmarkEnd w:id="108"/>
+    <w:bookmarkStart w:id="109" w:name="tool-attribution-colophon"/>
     <w:p>
       <w:pPr>
         <w:pStyle w:val="Heading1"/>
@@ -24666,7 +24861,7 @@
         <w:t xml:space="preserve">(September 2026).</w:t>
       </w:r>
     </w:p>
-    <w:bookmarkEnd w:id="108"/>
+    <w:bookmarkEnd w:id="109"/>
     <w:sectPr>
       <w:footnotePr>
         <w:numRestart w:val="eachSect"/>

</xml_diff>

<commit_message>
feat(epub): add standalone EPUB3 generation with 53 rasterized figures, MathML and KDP cover
</commit_message>
<xml_diff>
--- a/book/build/The_Conative_Integrative_Framework_Book_Thomas_Riebl_EN_6x9.docx
+++ b/book/build/The_Conative_Integrative_Framework_Book_Thomas_Riebl_EN_6x9.docx
@@ -12655,6 +12655,20 @@
         <w:pStyle w:val="FirstParagraph"/>
       </w:pPr>
       <w:r>
+        <w:t xml:space="preserve">Figure 3.2:</w:t>
+      </w:r>
+      <w:r>
+        <w:t xml:space="preserve"> </w:t>
+      </w:r>
+      <w:r>
+        <w:t xml:space="preserve">The Unfolding Theorem: Recurrent Interiority vs. Feedforward Zombie.</w:t>
+      </w:r>
+    </w:p>
+    <w:p>
+      <w:pPr>
+        <w:pStyle w:val="BodyText"/>
+      </w:pPr>
+      <w:r>
         <w:t xml:space="preserve">By the Krohn-Rhodes algebraic decomposition theorem, any finite recurrent neural network</w:t>
       </w:r>
       <w:r>
@@ -14330,6 +14344,37 @@
         <w:t xml:space="preserve">    end</w:t>
       </w:r>
     </w:p>
+    <w:p>
+      <w:pPr>
+        <w:pStyle w:val="FirstParagraph"/>
+      </w:pPr>
+      <w:r>
+        <w:t xml:space="preserve">Figure 3.3:</w:t>
+      </w:r>
+      <w:r>
+        <w:t xml:space="preserve"> </w:t>
+      </w:r>
+      <w:r>
+        <w:t xml:space="preserve">Calculation of Integrated Information</w:t>
+      </w:r>
+      <w:r>
+        <w:t xml:space="preserve"> </w:t>
+      </w:r>
+      <m:oMath>
+        <m:r>
+          <m:rPr>
+            <m:sty m:val="p"/>
+          </m:rPr>
+          <m:t>Φ</m:t>
+        </m:r>
+      </m:oMath>
+      <w:r>
+        <w:t xml:space="preserve"> </w:t>
+      </w:r>
+      <w:r>
+        <w:t xml:space="preserve">via Minimum Information Partition.</w:t>
+      </w:r>
+    </w:p>
     <w:bookmarkEnd w:id="48"/>
     <w:bookmarkStart w:id="49" w:name="X6b50fbbd4d08c31598db77b83b7749ffa1de6bb"/>
     <w:p>
@@ -14856,6 +14901,20 @@
           <w:rStyle w:val="VerbatimChar"/>
         </w:rPr>
         <w:t xml:space="preserve">    end</w:t>
+      </w:r>
+    </w:p>
+    <w:p>
+      <w:pPr>
+        <w:pStyle w:val="FirstParagraph"/>
+      </w:pPr>
+      <w:r>
+        <w:t xml:space="preserve">Figure 3.4:</w:t>
+      </w:r>
+      <w:r>
+        <w:t xml:space="preserve"> </w:t>
+      </w:r>
+      <w:r>
+        <w:t xml:space="preserve">Qualia Space Geometry: From Mechanisms to Phenomenal Polyhedra.</w:t>
       </w:r>
     </w:p>
     <w:bookmarkStart w:id="51" w:name="distinctions-the-vertices-of-experience"/>
@@ -16141,6 +16200,20 @@
           <w:rStyle w:val="VerbatimChar"/>
         </w:rPr>
         <w:t xml:space="preserve">    end</w:t>
+      </w:r>
+    </w:p>
+    <w:p>
+      <w:pPr>
+        <w:pStyle w:val="FirstParagraph"/>
+      </w:pPr>
+      <w:r>
+        <w:t xml:space="preserve">Figure 3.5:</w:t>
+      </w:r>
+      <w:r>
+        <w:t xml:space="preserve"> </w:t>
+      </w:r>
+      <w:r>
+        <w:t xml:space="preserve">The Paradox of Transient Causal Phantoms in Static IIT.</w:t>
       </w:r>
     </w:p>
     <w:bookmarkStart w:id="55" w:name="the-absurd-consequences-of-static-iit"/>
@@ -23108,6 +23181,20 @@
         <w:pStyle w:val="FirstParagraph"/>
       </w:pPr>
       <w:r>
+        <w:t xml:space="preserve">Figure 4.3:</w:t>
+      </w:r>
+      <w:r>
+        <w:t xml:space="preserve"> </w:t>
+      </w:r>
+      <w:r>
+        <w:t xml:space="preserve">Rate-Distortion Optimization in the Conscious Alter.</w:t>
+      </w:r>
+    </w:p>
+    <w:p>
+      <w:pPr>
+        <w:pStyle w:val="BodyText"/>
+      </w:pPr>
+      <w:r>
         <w:t xml:space="preserve">Under the CIF:</w:t>
       </w:r>
       <w:r>
@@ -23420,6 +23507,20 @@
           <w:rStyle w:val="VerbatimChar"/>
         </w:rPr>
         <w:t xml:space="preserve">    end</w:t>
+      </w:r>
+    </w:p>
+    <w:p>
+      <w:pPr>
+        <w:pStyle w:val="FirstParagraph"/>
+      </w:pPr>
+      <w:r>
+        <w:t xml:space="preserve">Figure 4.4:</w:t>
+      </w:r>
+      <w:r>
+        <w:t xml:space="preserve"> </w:t>
+      </w:r>
+      <w:r>
+        <w:t xml:space="preserve">The Information-Geometric Manifold of Phenomenal States.</w:t>
       </w:r>
     </w:p>
     <w:bookmarkStart w:id="73" w:name="the-fisher-rao-metric-tensor"/>
@@ -24848,6 +24949,20 @@
     <w:p>
       <w:pPr>
         <w:pStyle w:val="FirstParagraph"/>
+      </w:pPr>
+      <w:r>
+        <w:t xml:space="preserve">Figure 4.5:</w:t>
+      </w:r>
+      <w:r>
+        <w:t xml:space="preserve"> </w:t>
+      </w:r>
+      <w:r>
+        <w:t xml:space="preserve">The Three Dynamical Regimes of Active Inference Networks.</w:t>
+      </w:r>
+    </w:p>
+    <w:p>
+      <w:pPr>
+        <w:pStyle w:val="BodyText"/>
       </w:pPr>
       <w:r>
         <w:t xml:space="preserve">In our recurrent Active Inference simulations, the system does not require an external engineer to fine-tune its parameters. Rather,</w:t>
@@ -34333,6 +34448,20 @@
         <w:t xml:space="preserve">    end</w:t>
       </w:r>
     </w:p>
+    <w:p>
+      <w:pPr>
+        <w:pStyle w:val="FirstParagraph"/>
+      </w:pPr>
+      <w:r>
+        <w:t xml:space="preserve">Figure 7.3:</w:t>
+      </w:r>
+      <w:r>
+        <w:t xml:space="preserve"> </w:t>
+      </w:r>
+      <w:r>
+        <w:t xml:space="preserve">Phase Space Attractor Geometry and Dynamic Regimes.</w:t>
+      </w:r>
+    </w:p>
     <w:bookmarkStart w:id="123" w:name="the-stability-metric"/>
     <w:p>
       <w:pPr>
@@ -39180,6 +39309,20 @@
         <w:t xml:space="preserve">    end</w:t>
       </w:r>
     </w:p>
+    <w:p>
+      <w:pPr>
+        <w:pStyle w:val="FirstParagraph"/>
+      </w:pPr>
+      <w:r>
+        <w:t xml:space="preserve">Figure 8.2:</w:t>
+      </w:r>
+      <w:r>
+        <w:t xml:space="preserve"> </w:t>
+      </w:r>
+      <w:r>
+        <w:t xml:space="preserve">The Multiscale Nested Hierarchy of Active Inference.</w:t>
+      </w:r>
+    </w:p>
     <w:bookmarkStart w:id="145" w:name="X11b18474222a8907bdd4cfbe3d7647993dc2706"/>
     <w:p>
       <w:pPr>
@@ -40695,6 +40838,20 @@
           <w:rStyle w:val="VerbatimChar"/>
         </w:rPr>
         <w:t xml:space="preserve">    end</w:t>
+      </w:r>
+    </w:p>
+    <w:p>
+      <w:pPr>
+        <w:pStyle w:val="FirstParagraph"/>
+      </w:pPr>
+      <w:r>
+        <w:t xml:space="preserve">Figure 8.5:</w:t>
+      </w:r>
+      <w:r>
+        <w:t xml:space="preserve"> </w:t>
+      </w:r>
+      <w:r>
+        <w:t xml:space="preserve">The Architectural Divide: Feedforward AI vs. Conscious Alters.</w:t>
       </w:r>
     </w:p>
     <w:bookmarkStart w:id="151" w:name="Xa358d7e6c19936a0883637b32f027cfafdc71a0"/>

</xml_diff>